<commit_message>
Update Doc00 acoustic agenda
</commit_message>
<xml_diff>
--- a/docs/SCW16-Doc00.docx
+++ b/docs/SCW16-Doc00.docx
@@ -84,7 +84,7 @@
         <w:t xml:space="preserve">Erich Diaz, Ignacio Payá, José Zenteno, Sebastián Vásquez, and Niels Hintzen.</w:t>
       </w:r>
     </w:p>
-    <w:bookmarkStart w:id="9" w:name="X3c14e84487627fe36a19ff569c774c2d12c20b1"/>
+    <w:bookmarkStart w:id="12" w:name="X3c14e84487627fe36a19ff569c774c2d12c20b1"/>
     <w:p>
       <w:pPr>
         <w:pStyle w:val="Heading2"/>
@@ -113,6 +113,15 @@
       </w:r>
       <w:r>
         <w:t xml:space="preserve">09:00</w:t>
+      </w:r>
+    </w:p>
+    <w:bookmarkStart w:id="9" w:name="session-1"/>
+    <w:p>
+      <w:pPr>
+        <w:pStyle w:val="Heading3"/>
+      </w:pPr>
+      <w:r>
+        <w:t xml:space="preserve">Session 1</w:t>
       </w:r>
     </w:p>
     <w:tbl>
@@ -173,7 +182,7 @@
               <w:pStyle w:val="Compact"/>
             </w:pPr>
             <w:r>
-              <w:t xml:space="preserve">09:00-09:25</w:t>
+              <w:t xml:space="preserve">09:00-09:20</w:t>
             </w:r>
           </w:p>
         </w:tc>
@@ -208,7 +217,77 @@
               <w:pStyle w:val="Compact"/>
             </w:pPr>
             <w:r>
-              <w:t xml:space="preserve">09:25-09:50</w:t>
+              <w:t xml:space="preserve">09:20-09:40</w:t>
+            </w:r>
+          </w:p>
+        </w:tc>
+        <w:tc>
+          <w:tcPr/>
+          <w:p>
+            <w:pPr>
+              <w:pStyle w:val="Compact"/>
+            </w:pPr>
+            <w:r>
+              <w:t xml:space="preserve">Preliminary results of the 2026 north-central Chile hydroacoustic survey</w:t>
+            </w:r>
+          </w:p>
+        </w:tc>
+        <w:tc>
+          <w:tcPr/>
+          <w:p>
+            <w:pPr>
+              <w:pStyle w:val="Compact"/>
+            </w:pPr>
+            <w:r>
+              <w:t xml:space="preserve">V. Catasti (IFOP)</w:t>
+            </w:r>
+          </w:p>
+        </w:tc>
+      </w:tr>
+      <w:tr>
+        <w:tc>
+          <w:tcPr/>
+          <w:p>
+            <w:pPr>
+              <w:pStyle w:val="Compact"/>
+            </w:pPr>
+            <w:r>
+              <w:t xml:space="preserve">09:40-10:00</w:t>
+            </w:r>
+          </w:p>
+        </w:tc>
+        <w:tc>
+          <w:tcPr/>
+          <w:p>
+            <w:pPr>
+              <w:pStyle w:val="Compact"/>
+            </w:pPr>
+            <w:r>
+              <w:t xml:space="preserve">Oceanography conditions during the 2026 acoustic survey</w:t>
+            </w:r>
+          </w:p>
+        </w:tc>
+        <w:tc>
+          <w:tcPr/>
+          <w:p>
+            <w:pPr>
+              <w:pStyle w:val="Compact"/>
+            </w:pPr>
+            <w:r>
+              <w:t xml:space="preserve">J. Letelier (IFOP)</w:t>
+            </w:r>
+          </w:p>
+        </w:tc>
+      </w:tr>
+      <w:tr>
+        <w:tc>
+          <w:tcPr/>
+          <w:p>
+            <w:pPr>
+              <w:pStyle w:val="Compact"/>
+            </w:pPr>
+            <w:r>
+              <w:t xml:space="preserve">10:00-10:20</w:t>
             </w:r>
           </w:p>
         </w:tc>
@@ -252,42 +331,7 @@
               <w:pStyle w:val="Compact"/>
             </w:pPr>
             <w:r>
-              <w:t xml:space="preserve">09:50-10:15</w:t>
-            </w:r>
-          </w:p>
-        </w:tc>
-        <w:tc>
-          <w:tcPr/>
-          <w:p>
-            <w:pPr>
-              <w:pStyle w:val="Compact"/>
-            </w:pPr>
-            <w:r>
-              <w:t xml:space="preserve">Preliminary results of the 2026 north-central Chile hydroacoustic survey</w:t>
-            </w:r>
-          </w:p>
-        </w:tc>
-        <w:tc>
-          <w:tcPr/>
-          <w:p>
-            <w:pPr>
-              <w:pStyle w:val="Compact"/>
-            </w:pPr>
-            <w:r>
-              <w:t xml:space="preserve">V. Catasti (IFOP)</w:t>
-            </w:r>
-          </w:p>
-        </w:tc>
-      </w:tr>
-      <w:tr>
-        <w:tc>
-          <w:tcPr/>
-          <w:p>
-            <w:pPr>
-              <w:pStyle w:val="Compact"/>
-            </w:pPr>
-            <w:r>
-              <w:t xml:space="preserve">10:15-10:30</w:t>
+              <w:t xml:space="preserve">10:20-10:40</w:t>
             </w:r>
           </w:p>
         </w:tc>
@@ -311,13 +355,120 @@
           </w:p>
         </w:tc>
       </w:tr>
+      <w:tr>
+        <w:tc>
+          <w:tcPr/>
+          <w:p>
+            <w:pPr>
+              <w:pStyle w:val="Compact"/>
+            </w:pPr>
+            <w:r>
+              <w:t xml:space="preserve">10:40-11:00</w:t>
+            </w:r>
+          </w:p>
+        </w:tc>
+        <w:tc>
+          <w:tcPr/>
+          <w:p>
+            <w:pPr>
+              <w:pStyle w:val="Compact"/>
+            </w:pPr>
+            <w:r>
+              <w:t xml:space="preserve">Toward a standardised abundance index for Chilean jack mackerel: spatio-temporal modelling of acoustic survey data in northern Chile</w:t>
+            </w:r>
+          </w:p>
+        </w:tc>
+        <w:tc>
+          <w:tcPr/>
+          <w:p>
+            <w:pPr>
+              <w:pStyle w:val="Compact"/>
+            </w:pPr>
+            <w:r>
+              <w:t xml:space="preserve">M.G. Pennino, S. Vásquez, N. Alegría, and A. Sepúlveda (INPESCA)</w:t>
+            </w:r>
+          </w:p>
+        </w:tc>
+      </w:tr>
+      <w:tr>
+        <w:tc>
+          <w:tcPr/>
+          <w:p>
+            <w:pPr>
+              <w:pStyle w:val="Compact"/>
+            </w:pPr>
+            <w:r>
+              <w:t xml:space="preserve">11:00-11:20</w:t>
+            </w:r>
+          </w:p>
+        </w:tc>
+        <w:tc>
+          <w:tcPr/>
+          <w:p>
+            <w:pPr>
+              <w:pStyle w:val="Compact"/>
+            </w:pPr>
+            <w:r>
+              <w:t xml:space="preserve">Opportunistic acoustic data collection using the south-central Chilean commercial fleet</w:t>
+            </w:r>
+          </w:p>
+        </w:tc>
+        <w:tc>
+          <w:tcPr/>
+          <w:p>
+            <w:pPr>
+              <w:pStyle w:val="Compact"/>
+            </w:pPr>
+            <w:r>
+              <w:t xml:space="preserve">N. Alegría (INPESCA)</w:t>
+            </w:r>
+          </w:p>
+        </w:tc>
+      </w:tr>
+      <w:tr>
+        <w:tc>
+          <w:tcPr/>
+          <w:p>
+            <w:pPr>
+              <w:pStyle w:val="Compact"/>
+            </w:pPr>
+            <w:r>
+              <w:t xml:space="preserve">11:20-11:40</w:t>
+            </w:r>
+          </w:p>
+        </w:tc>
+        <w:tc>
+          <w:tcPr/>
+          <w:p>
+            <w:pPr>
+              <w:pStyle w:val="Compact"/>
+            </w:pPr>
+            <w:r>
+              <w:t xml:space="preserve">Review of jack mackerel acoustic assessments conducted in Peru</w:t>
+            </w:r>
+          </w:p>
+        </w:tc>
+        <w:tc>
+          <w:tcPr/>
+          <w:p>
+            <w:pPr>
+              <w:pStyle w:val="Compact"/>
+            </w:pPr>
+            <w:r>
+              <w:t xml:space="preserve">Daniel Grados (IMARPE)</w:t>
+            </w:r>
+          </w:p>
+        </w:tc>
+      </w:tr>
     </w:tbl>
+    <w:bookmarkEnd w:id="9"/>
+    <w:bookmarkStart w:id="10" w:name="session-2"/>
     <w:p>
       <w:pPr>
-        <w:pStyle w:val="BodyText"/>
-      </w:pPr>
-      <w:r>
-        <w:t xml:space="preserve"> </w:t>
+        <w:pStyle w:val="Heading3"/>
+      </w:pPr>
+      <w:r>
+        <w:t xml:space="preserve">Session 2</w:t>
       </w:r>
     </w:p>
     <w:tbl>
@@ -378,112 +529,42 @@
               <w:pStyle w:val="Compact"/>
             </w:pPr>
             <w:r>
-              <w:t xml:space="preserve">10:30-11:00</w:t>
-            </w:r>
-          </w:p>
-        </w:tc>
-        <w:tc>
-          <w:tcPr/>
-          <w:p>
-            <w:pPr>
-              <w:pStyle w:val="Compact"/>
-            </w:pPr>
-            <w:r>
-              <w:t xml:space="preserve">Examination and/or validation of jack mackerel echotraces</w:t>
-            </w:r>
-          </w:p>
-        </w:tc>
-        <w:tc>
-          <w:tcPr/>
-          <w:p>
-            <w:pPr>
-              <w:pStyle w:val="Compact"/>
-            </w:pPr>
-            <w:r>
-              <w:t xml:space="preserve">All participants</w:t>
-            </w:r>
-          </w:p>
-        </w:tc>
-      </w:tr>
-      <w:tr>
-        <w:tc>
-          <w:tcPr/>
-          <w:p>
-            <w:pPr>
-              <w:pStyle w:val="Compact"/>
-            </w:pPr>
-            <w:r>
-              <w:t xml:space="preserve">11:00-11:25</w:t>
-            </w:r>
-          </w:p>
-        </w:tc>
-        <w:tc>
-          <w:tcPr/>
-          <w:p>
-            <w:pPr>
-              <w:pStyle w:val="Compact"/>
-            </w:pPr>
-            <w:r>
-              <w:t xml:space="preserve">Opportunistic acoustic data collection using the south-central Chilean commercial fleet</w:t>
-            </w:r>
-          </w:p>
-        </w:tc>
-        <w:tc>
-          <w:tcPr/>
-          <w:p>
-            <w:pPr>
-              <w:pStyle w:val="Compact"/>
-            </w:pPr>
-            <w:r>
-              <w:t xml:space="preserve">N. Alegría (INPESCA, TBC)</w:t>
-            </w:r>
-          </w:p>
-        </w:tc>
-      </w:tr>
-      <w:tr>
-        <w:tc>
-          <w:tcPr/>
-          <w:p>
-            <w:pPr>
-              <w:pStyle w:val="Compact"/>
-            </w:pPr>
-            <w:r>
-              <w:t xml:space="preserve">11:25-11:50</w:t>
-            </w:r>
-          </w:p>
-        </w:tc>
-        <w:tc>
-          <w:tcPr/>
-          <w:p>
-            <w:pPr>
-              <w:pStyle w:val="Compact"/>
-            </w:pPr>
-            <w:r>
-              <w:t xml:space="preserve">Review of jack mackerel acoustic assessments conducted in Peru</w:t>
-            </w:r>
-          </w:p>
-        </w:tc>
-        <w:tc>
-          <w:tcPr/>
-          <w:p>
-            <w:pPr>
-              <w:pStyle w:val="Compact"/>
-            </w:pPr>
-            <w:r>
-              <w:t xml:space="preserve">Daniel Grados (IMARPE)</w:t>
-            </w:r>
-          </w:p>
-        </w:tc>
-      </w:tr>
-      <w:tr>
-        <w:tc>
-          <w:tcPr/>
-          <w:p>
-            <w:pPr>
-              <w:pStyle w:val="Compact"/>
-            </w:pPr>
-            <w:r>
-              <w:t xml:space="preserve">11:50-13:20</w:t>
+              <w:t xml:space="preserve">11:40-12:00</w:t>
+            </w:r>
+          </w:p>
+        </w:tc>
+        <w:tc>
+          <w:tcPr/>
+          <w:p>
+            <w:pPr>
+              <w:pStyle w:val="Compact"/>
+            </w:pPr>
+            <w:r>
+              <w:t xml:space="preserve">Application of sonar systems in Peruvian anchoveta fisheries and potential applicability for jack mackerel in Peru and Chile</w:t>
+            </w:r>
+          </w:p>
+        </w:tc>
+        <w:tc>
+          <w:tcPr/>
+          <w:p>
+            <w:pPr>
+              <w:pStyle w:val="Compact"/>
+            </w:pPr>
+            <w:r>
+              <w:t xml:space="preserve">M. Gutiérrez (Instituto Humboldt de Investigación Marina y Acuícola)</w:t>
+            </w:r>
+          </w:p>
+        </w:tc>
+      </w:tr>
+      <w:tr>
+        <w:tc>
+          <w:tcPr/>
+          <w:p>
+            <w:pPr>
+              <w:pStyle w:val="Compact"/>
+            </w:pPr>
+            <w:r>
+              <w:t xml:space="preserve">12:00-13:30</w:t>
             </w:r>
           </w:p>
         </w:tc>
@@ -508,12 +589,14 @@
         </w:tc>
       </w:tr>
     </w:tbl>
+    <w:bookmarkEnd w:id="10"/>
+    <w:bookmarkStart w:id="11" w:name="session-3"/>
     <w:p>
       <w:pPr>
-        <w:pStyle w:val="BodyText"/>
-      </w:pPr>
-      <w:r>
-        <w:t xml:space="preserve"> </w:t>
+        <w:pStyle w:val="Heading3"/>
+      </w:pPr>
+      <w:r>
+        <w:t xml:space="preserve">Session 3</w:t>
       </w:r>
     </w:p>
     <w:tbl>
@@ -574,53 +657,18 @@
               <w:pStyle w:val="Compact"/>
             </w:pPr>
             <w:r>
-              <w:t xml:space="preserve">13:20-13:45</w:t>
-            </w:r>
-          </w:p>
-        </w:tc>
-        <w:tc>
-          <w:tcPr/>
-          <w:p>
-            <w:pPr>
-              <w:pStyle w:val="Compact"/>
-            </w:pPr>
-            <w:r>
-              <w:t xml:space="preserve">Application of sonar systems in Peruvian anchoveta fisheries and potential applicability for jack mackerel in Peru and Chile</w:t>
-            </w:r>
-          </w:p>
-        </w:tc>
-        <w:tc>
-          <w:tcPr/>
-          <w:p>
-            <w:pPr>
-              <w:pStyle w:val="Compact"/>
-            </w:pPr>
-            <w:r>
-              <w:t xml:space="preserve">Mariano Gutiérrez (National University Federico Villarreal)</w:t>
-            </w:r>
-          </w:p>
-        </w:tc>
-      </w:tr>
-      <w:tr>
-        <w:tc>
-          <w:tcPr/>
-          <w:p>
-            <w:pPr>
-              <w:pStyle w:val="Compact"/>
-            </w:pPr>
-            <w:r>
-              <w:t xml:space="preserve">13:45-14:15</w:t>
-            </w:r>
-          </w:p>
-        </w:tc>
-        <w:tc>
-          <w:tcPr/>
-          <w:p>
-            <w:pPr>
-              <w:pStyle w:val="Compact"/>
-            </w:pPr>
-            <w:r>
-              <w:t xml:space="preserve">General discussion and technical recommendations</w:t>
+              <w:t xml:space="preserve">13:30-14:30</w:t>
+            </w:r>
+          </w:p>
+        </w:tc>
+        <w:tc>
+          <w:tcPr/>
+          <w:p>
+            <w:pPr>
+              <w:pStyle w:val="Compact"/>
+            </w:pPr>
+            <w:r>
+              <w:t xml:space="preserve">Examination and/or validation of jack mackerel echograms</w:t>
             </w:r>
           </w:p>
         </w:tc>
@@ -636,9 +684,112 @@
           </w:p>
         </w:tc>
       </w:tr>
+      <w:tr>
+        <w:tc>
+          <w:tcPr/>
+          <w:p>
+            <w:pPr>
+              <w:pStyle w:val="Compact"/>
+            </w:pPr>
+            <w:r>
+              <w:t xml:space="preserve">14:30-14:50</w:t>
+            </w:r>
+          </w:p>
+        </w:tc>
+        <w:tc>
+          <w:tcPr/>
+          <w:p>
+            <w:pPr>
+              <w:pStyle w:val="Compact"/>
+            </w:pPr>
+            <w:r>
+              <w:t xml:space="preserve">Coffee break</w:t>
+            </w:r>
+          </w:p>
+        </w:tc>
+        <w:tc>
+          <w:tcPr/>
+          <w:p>
+            <w:pPr>
+              <w:pStyle w:val="Compact"/>
+            </w:pPr>
+          </w:p>
+        </w:tc>
+      </w:tr>
+      <w:tr>
+        <w:tc>
+          <w:tcPr/>
+          <w:p>
+            <w:pPr>
+              <w:pStyle w:val="Compact"/>
+            </w:pPr>
+            <w:r>
+              <w:t xml:space="preserve">14:50-16:00</w:t>
+            </w:r>
+          </w:p>
+        </w:tc>
+        <w:tc>
+          <w:tcPr/>
+          <w:p>
+            <w:pPr>
+              <w:pStyle w:val="Compact"/>
+            </w:pPr>
+            <w:r>
+              <w:t xml:space="preserve">General discussion</w:t>
+            </w:r>
+          </w:p>
+        </w:tc>
+        <w:tc>
+          <w:tcPr/>
+          <w:p>
+            <w:pPr>
+              <w:pStyle w:val="Compact"/>
+            </w:pPr>
+            <w:r>
+              <w:t xml:space="preserve">All participants</w:t>
+            </w:r>
+          </w:p>
+        </w:tc>
+      </w:tr>
+      <w:tr>
+        <w:tc>
+          <w:tcPr/>
+          <w:p>
+            <w:pPr>
+              <w:pStyle w:val="Compact"/>
+            </w:pPr>
+            <w:r>
+              <w:t xml:space="preserve">16:00-17:00</w:t>
+            </w:r>
+          </w:p>
+        </w:tc>
+        <w:tc>
+          <w:tcPr/>
+          <w:p>
+            <w:pPr>
+              <w:pStyle w:val="Compact"/>
+            </w:pPr>
+            <w:r>
+              <w:t xml:space="preserve">Technical recommendations</w:t>
+            </w:r>
+          </w:p>
+        </w:tc>
+        <w:tc>
+          <w:tcPr/>
+          <w:p>
+            <w:pPr>
+              <w:pStyle w:val="Compact"/>
+            </w:pPr>
+            <w:r>
+              <w:t xml:space="preserve">All participants</w:t>
+            </w:r>
+          </w:p>
+        </w:tc>
+      </w:tr>
     </w:tbl>
-    <w:bookmarkEnd w:id="9"/>
-    <w:bookmarkStart w:id="11" w:name="X714c2cb5fc0ded1c3db2bdb64c8d0ee6121c99c"/>
+    <w:bookmarkEnd w:id="11"/>
+    <w:bookmarkEnd w:id="12"/>
+    <w:bookmarkStart w:id="14" w:name="X714c2cb5fc0ded1c3db2bdb64c8d0ee6121c99c"/>
     <w:p>
       <w:pPr>
         <w:pStyle w:val="Heading2"/>
@@ -646,7 +797,7 @@
       <w:r>
         <w:t xml:space="preserve">Day 2. Preliminary CPUE Session Agenda (</w:t>
       </w:r>
-      <w:hyperlink r:id="rId10">
+      <w:hyperlink r:id="rId13">
         <w:r>
           <w:rPr>
             <w:rStyle w:val="Hyperlink"/>
@@ -680,7 +831,7 @@
       <w:r>
         <w:t xml:space="preserve"> </w:t>
       </w:r>
-      <w:hyperlink r:id="rId10">
+      <w:hyperlink r:id="rId13">
         <w:r>
           <w:rPr>
             <w:rStyle w:val="Hyperlink"/>
@@ -1015,8 +1166,8 @@
         </w:tc>
       </w:tr>
     </w:tbl>
-    <w:bookmarkEnd w:id="11"/>
-    <w:bookmarkStart w:id="12" w:name="Xdddbf6479f3c4ab0ba51ce45a980492bec0f743"/>
+    <w:bookmarkEnd w:id="14"/>
+    <w:bookmarkStart w:id="15" w:name="Xdddbf6479f3c4ab0ba51ce45a980492bec0f743"/>
     <w:p>
       <w:pPr>
         <w:pStyle w:val="Heading2"/>
@@ -1216,8 +1367,8 @@
         </w:tc>
       </w:tr>
     </w:tbl>
-    <w:bookmarkEnd w:id="12"/>
-    <w:bookmarkStart w:id="13" w:name="Xff1c17e19db480750123204ba998bf160cd477b"/>
+    <w:bookmarkEnd w:id="15"/>
+    <w:bookmarkStart w:id="16" w:name="Xff1c17e19db480750123204ba998bf160cd477b"/>
     <w:p>
       <w:pPr>
         <w:pStyle w:val="Heading2"/>
@@ -1405,8 +1556,8 @@
         </w:tc>
       </w:tr>
     </w:tbl>
-    <w:bookmarkEnd w:id="13"/>
-    <w:bookmarkStart w:id="14" w:name="X8de8fe1d907eaae9c1bb1b7a5cd9ab8dee6c6d4"/>
+    <w:bookmarkEnd w:id="16"/>
+    <w:bookmarkStart w:id="17" w:name="X8de8fe1d907eaae9c1bb1b7a5cd9ab8dee6c6d4"/>
     <w:p>
       <w:pPr>
         <w:pStyle w:val="Heading2"/>
@@ -1556,7 +1707,7 @@
         </w:tc>
       </w:tr>
     </w:tbl>
-    <w:bookmarkEnd w:id="14"/>
+    <w:bookmarkEnd w:id="17"/>
     <w:sectPr>
       <w:footnotePr>
         <w:numRestart w:val="eachSect"/>

</xml_diff>

<commit_message>
Update Doc00 acoustic agenda from Ver3
</commit_message>
<xml_diff>
--- a/docs/SCW16-Doc00.docx
+++ b/docs/SCW16-Doc00.docx
@@ -455,7 +455,7 @@
               <w:pStyle w:val="Compact"/>
             </w:pPr>
             <w:r>
-              <w:t xml:space="preserve">Daniel Grados (IMARPE)</w:t>
+              <w:t xml:space="preserve">Carlos Valdes (IMARPE)</w:t>
             </w:r>
           </w:p>
         </w:tc>
@@ -551,6 +551,41 @@
               <w:pStyle w:val="Compact"/>
             </w:pPr>
             <w:r>
+              <w:t xml:space="preserve">Daniel Grados (IMARPE)</w:t>
+            </w:r>
+          </w:p>
+        </w:tc>
+      </w:tr>
+      <w:tr>
+        <w:tc>
+          <w:tcPr/>
+          <w:p>
+            <w:pPr>
+              <w:pStyle w:val="Compact"/>
+            </w:pPr>
+            <w:r>
+              <w:t xml:space="preserve">12:20-12:40</w:t>
+            </w:r>
+          </w:p>
+        </w:tc>
+        <w:tc>
+          <w:tcPr/>
+          <w:p>
+            <w:pPr>
+              <w:pStyle w:val="Compact"/>
+            </w:pPr>
+            <w:r>
+              <w:t xml:space="preserve">Use of acoustic data collected by fishing vessels for estimating the abundance/biomass of anchovy and Chilean jack mackerel in Peru</w:t>
+            </w:r>
+          </w:p>
+        </w:tc>
+        <w:tc>
+          <w:tcPr/>
+          <w:p>
+            <w:pPr>
+              <w:pStyle w:val="Compact"/>
+            </w:pPr>
+            <w:r>
               <w:t xml:space="preserve">M. Gutiérrez (Instituto Humboldt de Investigación Marina y Acuícola)</w:t>
             </w:r>
           </w:p>
@@ -564,18 +599,18 @@
               <w:pStyle w:val="Compact"/>
             </w:pPr>
             <w:r>
-              <w:t xml:space="preserve">12:00-13:30</w:t>
-            </w:r>
-          </w:p>
-        </w:tc>
-        <w:tc>
-          <w:tcPr/>
-          <w:p>
-            <w:pPr>
-              <w:pStyle w:val="Compact"/>
-            </w:pPr>
-            <w:r>
-              <w:t xml:space="preserve">Lunch break (1 hour 30 minutes)</w:t>
+              <w:t xml:space="preserve">12:40-14:00</w:t>
+            </w:r>
+          </w:p>
+        </w:tc>
+        <w:tc>
+          <w:tcPr/>
+          <w:p>
+            <w:pPr>
+              <w:pStyle w:val="Compact"/>
+            </w:pPr>
+            <w:r>
+              <w:t xml:space="preserve">Lunch break (1 hour 40 minutes)</w:t>
             </w:r>
           </w:p>
         </w:tc>
@@ -657,7 +692,7 @@
               <w:pStyle w:val="Compact"/>
             </w:pPr>
             <w:r>
-              <w:t xml:space="preserve">13:30-14:30</w:t>
+              <w:t xml:space="preserve">14:00-15:00</w:t>
             </w:r>
           </w:p>
         </w:tc>
@@ -692,7 +727,7 @@
               <w:pStyle w:val="Compact"/>
             </w:pPr>
             <w:r>
-              <w:t xml:space="preserve">14:30-14:50</w:t>
+              <w:t xml:space="preserve">15:00-15:20</w:t>
             </w:r>
           </w:p>
         </w:tc>
@@ -724,7 +759,7 @@
               <w:pStyle w:val="Compact"/>
             </w:pPr>
             <w:r>
-              <w:t xml:space="preserve">14:50-16:00</w:t>
+              <w:t xml:space="preserve">15:20-16:20</w:t>
             </w:r>
           </w:p>
         </w:tc>
@@ -759,7 +794,7 @@
               <w:pStyle w:val="Compact"/>
             </w:pPr>
             <w:r>
-              <w:t xml:space="preserve">16:00-17:00</w:t>
+              <w:t xml:space="preserve">16:20-17:00</w:t>
             </w:r>
           </w:p>
         </w:tc>

</xml_diff>

<commit_message>
Update Doc00 with Peruvian report agenda items
</commit_message>
<xml_diff>
--- a/docs/SCW16-Doc00.docx
+++ b/docs/SCW16-Doc00.docx
@@ -890,395 +890,42 @@
         <w:t xml:space="preserve">benchmark session.</w:t>
       </w:r>
     </w:p>
-    <w:tbl>
-      <w:tblPr>
-        <w:tblStyle w:val="Table"/>
-        <w:tblW w:type="pct" w:w="5000"/>
-        <w:tblLayout w:type="fixed"/>
-        <w:tblLook w:firstRow="1" w:lastRow="0" w:firstColumn="0" w:lastColumn="0" w:noHBand="0" w:noVBand="0" w:val="0020"/>
-      </w:tblPr>
-      <w:tblGrid>
-        <w:gridCol w:w="2640"/>
-        <w:gridCol w:w="2640"/>
-        <w:gridCol w:w="2640"/>
-      </w:tblGrid>
-      <w:tr>
-        <w:trPr>
-          <w:tblHeader w:val="on"/>
-        </w:trPr>
-        <w:tc>
-          <w:tcPr/>
-          <w:p>
-            <w:pPr>
-              <w:pStyle w:val="Compact"/>
-            </w:pPr>
-            <w:r>
-              <w:t xml:space="preserve">Order</w:t>
-            </w:r>
-          </w:p>
-        </w:tc>
-        <w:tc>
-          <w:tcPr/>
-          <w:p>
-            <w:pPr>
-              <w:pStyle w:val="Compact"/>
-            </w:pPr>
-            <w:r>
-              <w:t xml:space="preserve">Topic</w:t>
-            </w:r>
-          </w:p>
-        </w:tc>
-        <w:tc>
-          <w:tcPr/>
-          <w:p>
-            <w:pPr>
-              <w:pStyle w:val="Compact"/>
-            </w:pPr>
-            <w:r>
-              <w:t xml:space="preserve">Notes</w:t>
-            </w:r>
-          </w:p>
-        </w:tc>
-      </w:tr>
-      <w:tr>
-        <w:tc>
-          <w:tcPr/>
-          <w:p>
-            <w:pPr>
-              <w:pStyle w:val="Compact"/>
-            </w:pPr>
-            <w:r>
-              <w:t xml:space="preserve">1</w:t>
-            </w:r>
-          </w:p>
-        </w:tc>
-        <w:tc>
-          <w:tcPr/>
-          <w:p>
-            <w:pPr>
-              <w:pStyle w:val="Compact"/>
-            </w:pPr>
-            <w:r>
-              <w:t xml:space="preserve">Metadata by fleet and country</w:t>
-            </w:r>
-          </w:p>
-        </w:tc>
-        <w:tc>
-          <w:tcPr/>
-          <w:p>
-            <w:pPr>
-              <w:pStyle w:val="Compact"/>
-            </w:pPr>
-            <w:r>
-              <w:t xml:space="preserve">Review fleet definitions, spatial coverage, observation level, and index construction by country and fishery.</w:t>
-            </w:r>
-          </w:p>
-        </w:tc>
-      </w:tr>
-      <w:tr>
-        <w:tc>
-          <w:tcPr/>
-          <w:p>
-            <w:pPr>
-              <w:pStyle w:val="Compact"/>
-            </w:pPr>
-            <w:r>
-              <w:t xml:space="preserve">2</w:t>
-            </w:r>
-          </w:p>
-        </w:tc>
-        <w:tc>
-          <w:tcPr/>
-          <w:p>
-            <w:pPr>
-              <w:pStyle w:val="Compact"/>
-            </w:pPr>
-            <w:r>
-              <w:t xml:space="preserve">Methods by fleet and country</w:t>
-            </w:r>
-          </w:p>
-        </w:tc>
-        <w:tc>
-          <w:tcPr/>
-          <w:p>
-            <w:pPr>
-              <w:pStyle w:val="Compact"/>
-            </w:pPr>
-            <w:r>
-              <w:t xml:space="preserve">Compare GLM, spatio-temporal models, GLMMs with spatio-temporal random effects, and latitude-longitude smoothing approaches.</w:t>
-            </w:r>
-          </w:p>
-        </w:tc>
-      </w:tr>
-      <w:tr>
-        <w:tc>
-          <w:tcPr/>
-          <w:p>
-            <w:pPr>
-              <w:pStyle w:val="Compact"/>
-            </w:pPr>
-            <w:r>
-              <w:t xml:space="preserve">3</w:t>
-            </w:r>
-          </w:p>
-        </w:tc>
-        <w:tc>
-          <w:tcPr/>
-          <w:p>
-            <w:pPr>
-              <w:pStyle w:val="Compact"/>
-            </w:pPr>
-            <w:r>
-              <w:t xml:space="preserve">Comparative analysis and parsimony across candidate indices</w:t>
-            </w:r>
-          </w:p>
-        </w:tc>
-        <w:tc>
-          <w:tcPr/>
-          <w:p>
-            <w:pPr>
-              <w:pStyle w:val="Compact"/>
-            </w:pPr>
-            <w:r>
-              <w:t xml:space="preserve">Evaluate traditional GLM, spatio-temporal, and environmentally informed approaches and identify the most suitable benchmark candidates.</w:t>
-            </w:r>
-          </w:p>
-        </w:tc>
-      </w:tr>
-      <w:tr>
-        <w:tc>
-          <w:tcPr/>
-          <w:p>
-            <w:pPr>
-              <w:pStyle w:val="Compact"/>
-            </w:pPr>
-            <w:r>
-              <w:t xml:space="preserve">4</w:t>
-            </w:r>
-          </w:p>
-        </w:tc>
-        <w:tc>
-          <w:tcPr/>
-          <w:p>
-            <w:pPr>
-              <w:pStyle w:val="Compact"/>
-            </w:pPr>
-            <w:r>
-              <w:t xml:space="preserve">Effort-creep review and decision for stock assessment use</w:t>
-            </w:r>
-          </w:p>
-        </w:tc>
-        <w:tc>
-          <w:tcPr/>
-          <w:p>
-            <w:pPr>
-              <w:pStyle w:val="Compact"/>
-            </w:pPr>
-            <w:r>
-              <w:t xml:space="preserve">Revisit current effort-creep assumptions and consider whether revised treatment is needed for benchmark runs.</w:t>
-            </w:r>
-          </w:p>
-        </w:tc>
-      </w:tr>
-      <w:tr>
-        <w:tc>
-          <w:tcPr/>
-          <w:p>
-            <w:pPr>
-              <w:pStyle w:val="Compact"/>
-            </w:pPr>
-            <w:r>
-              <w:t xml:space="preserve">5</w:t>
-            </w:r>
-          </w:p>
-        </w:tc>
-        <w:tc>
-          <w:tcPr/>
-          <w:p>
-            <w:pPr>
-              <w:pStyle w:val="Compact"/>
-            </w:pPr>
-            <w:r>
-              <w:t xml:space="preserve">Catchability-availability blocks by abundance index</w:t>
-            </w:r>
-          </w:p>
-        </w:tc>
-        <w:tc>
-          <w:tcPr/>
-          <w:p>
-            <w:pPr>
-              <w:pStyle w:val="Compact"/>
-            </w:pPr>
-            <w:r>
-              <w:t xml:space="preserve">Review evidence for temporal or spatial changes in availability, including possible El Niño effects and implications for</w:t>
-            </w:r>
-            <w:r>
-              <w:t xml:space="preserve"> </w:t>
-            </w:r>
-            <w:r>
-              <w:rPr>
-                <w:rStyle w:val="VerbatimChar"/>
-              </w:rPr>
-              <w:t xml:space="preserve">q</w:t>
-            </w:r>
-            <w:r>
-              <w:t xml:space="preserve"> </w:t>
-            </w:r>
-            <w:r>
-              <w:t xml:space="preserve">blocks.</w:t>
-            </w:r>
-          </w:p>
-        </w:tc>
-      </w:tr>
-      <w:tr>
-        <w:tc>
-          <w:tcPr/>
-          <w:p>
-            <w:pPr>
-              <w:pStyle w:val="Compact"/>
-            </w:pPr>
-            <w:r>
-              <w:t xml:space="preserve">6</w:t>
-            </w:r>
-          </w:p>
-        </w:tc>
-        <w:tc>
-          <w:tcPr/>
-          <w:p>
-            <w:pPr>
-              <w:pStyle w:val="Compact"/>
-            </w:pPr>
-            <w:r>
-              <w:t xml:space="preserve">CPUE weighting factors for stock assessment</w:t>
-            </w:r>
-          </w:p>
-        </w:tc>
-        <w:tc>
-          <w:tcPr/>
-          <w:p>
-            <w:pPr>
-              <w:pStyle w:val="Compact"/>
-            </w:pPr>
-            <w:r>
-              <w:t xml:space="preserve">Discuss weighting choices and how they affect assessment fits and benchmark comparisons.</w:t>
-            </w:r>
-          </w:p>
-        </w:tc>
-      </w:tr>
-      <w:tr>
-        <w:tc>
-          <w:tcPr/>
-          <w:p>
-            <w:pPr>
-              <w:pStyle w:val="Compact"/>
-            </w:pPr>
-            <w:r>
-              <w:t xml:space="preserve">7</w:t>
-            </w:r>
-          </w:p>
-        </w:tc>
-        <w:tc>
-          <w:tcPr/>
-          <w:p>
-            <w:pPr>
-              <w:pStyle w:val="Compact"/>
-            </w:pPr>
-            <w:r>
-              <w:t xml:space="preserve">Separate versus combined index products for HCR use</w:t>
-            </w:r>
-          </w:p>
-        </w:tc>
-        <w:tc>
-          <w:tcPr/>
-          <w:p>
-            <w:pPr>
-              <w:pStyle w:val="Compact"/>
-            </w:pPr>
-            <w:r>
-              <w:t xml:space="preserve">Consider whether the benchmark should retain separate series or define a combined CPUE product for OM conditioning and MP inputs.</w:t>
-            </w:r>
-          </w:p>
-        </w:tc>
-      </w:tr>
-    </w:tbl>
-    <w:bookmarkEnd w:id="14"/>
-    <w:bookmarkStart w:id="15" w:name="Xdddbf6479f3c4ab0ba51ce45a980492bec0f743"/>
     <w:p>
       <w:pPr>
-        <w:pStyle w:val="Heading2"/>
-      </w:pPr>
-      <w:r>
-        <w:t xml:space="preserve">Day 3. Recap, Report Drafting, and Biological Inputs</w:t>
-      </w:r>
-    </w:p>
-    <w:p>
-      <w:pPr>
-        <w:pStyle w:val="FirstParagraph"/>
-      </w:pPr>
-      <w:r>
-        <w:t xml:space="preserve">The morning session will be used to recap the Acoustic and CPUE sessions, identify</w:t>
-      </w:r>
-      <w:r>
-        <w:t xml:space="preserve"> </w:t>
-      </w:r>
-      <w:r>
-        <w:t xml:space="preserve">remaining loose ends, and begin drafting the corresponding report sections. The</w:t>
-      </w:r>
-      <w:r>
-        <w:t xml:space="preserve"> </w:t>
-      </w:r>
-      <w:r>
-        <w:t xml:space="preserve">objective is to document decisions, unresolved technical issues, and follow-up</w:t>
-      </w:r>
-      <w:r>
-        <w:t xml:space="preserve"> </w:t>
-      </w:r>
-      <w:r>
-        <w:t xml:space="preserve">tasks while the index discussions are still current.</w:t>
-      </w:r>
-    </w:p>
-    <w:p>
-      <w:pPr>
         <w:pStyle w:val="BodyText"/>
       </w:pPr>
       <w:r>
-        <w:t xml:space="preserve">The afternoon session will begin with a summary of SCW16-Doc01 and its</w:t>
-      </w:r>
-      <w:r>
-        <w:t xml:space="preserve"> </w:t>
-      </w:r>
-      <w:r>
-        <w:t xml:space="preserve">implications for benchmark and MSE development. This will be followed by a</w:t>
-      </w:r>
-      <w:r>
-        <w:t xml:space="preserve"> </w:t>
-      </w:r>
-      <w:r>
-        <w:t xml:space="preserve">review of the biological assumptions used in the assessment and operating-model</w:t>
-      </w:r>
-      <w:r>
-        <w:t xml:space="preserve"> </w:t>
-      </w:r>
-      <w:r>
-        <w:t xml:space="preserve">conditioning, including growth, maturity, natural mortality, weight-at-age,</w:t>
-      </w:r>
-      <w:r>
-        <w:t xml:space="preserve"> </w:t>
-      </w:r>
-      <w:r>
-        <w:t xml:space="preserve">stock structure, and recruitment-productivity assumptions. The discussion should</w:t>
-      </w:r>
-      <w:r>
-        <w:t xml:space="preserve"> </w:t>
-      </w:r>
-      <w:r>
-        <w:t xml:space="preserve">identify options for refining model runs and for defining a compact set of</w:t>
-      </w:r>
-      <w:r>
-        <w:t xml:space="preserve"> </w:t>
-      </w:r>
-      <w:r>
-        <w:t xml:space="preserve">assessment and OM alternatives for further evaluation.</w:t>
+        <w:t xml:space="preserve">The Peruvian delegation has requested time during the CPUE session for the report</w:t>
+      </w:r>
+      <w:r>
+        <w:t xml:space="preserve"> </w:t>
+      </w:r>
+      <w:r>
+        <w:rPr>
+          <w:i/>
+          <w:iCs/>
+        </w:rPr>
+        <w:t xml:space="preserve">Standardization of catch-per-unit-effort (CPUE) for jack mackerel (2015-2025)</w:t>
+      </w:r>
+      <w:r>
+        <w:rPr>
+          <w:i/>
+          <w:iCs/>
+        </w:rPr>
+        <w:t xml:space="preserve"> </w:t>
+      </w:r>
+      <w:r>
+        <w:rPr>
+          <w:i/>
+          <w:iCs/>
+        </w:rPr>
+        <w:t xml:space="preserve">in Peruvian national jurisdictional waters</w:t>
+      </w:r>
+      <w:r>
+        <w:t xml:space="preserve"> </w:t>
+      </w:r>
+      <w:r>
+        <w:t xml:space="preserve">(Miran Geronimo and Gersson Roman).</w:t>
       </w:r>
     </w:p>
     <w:tbl>
@@ -1304,6 +951,598 @@
               <w:pStyle w:val="Compact"/>
             </w:pPr>
             <w:r>
+              <w:t xml:space="preserve">Order</w:t>
+            </w:r>
+          </w:p>
+        </w:tc>
+        <w:tc>
+          <w:tcPr/>
+          <w:p>
+            <w:pPr>
+              <w:pStyle w:val="Compact"/>
+            </w:pPr>
+            <w:r>
+              <w:t xml:space="preserve">Topic</w:t>
+            </w:r>
+          </w:p>
+        </w:tc>
+        <w:tc>
+          <w:tcPr/>
+          <w:p>
+            <w:pPr>
+              <w:pStyle w:val="Compact"/>
+            </w:pPr>
+            <w:r>
+              <w:t xml:space="preserve">Notes</w:t>
+            </w:r>
+          </w:p>
+        </w:tc>
+      </w:tr>
+      <w:tr>
+        <w:tc>
+          <w:tcPr/>
+          <w:p>
+            <w:pPr>
+              <w:pStyle w:val="Compact"/>
+            </w:pPr>
+            <w:r>
+              <w:t xml:space="preserve">1</w:t>
+            </w:r>
+          </w:p>
+        </w:tc>
+        <w:tc>
+          <w:tcPr/>
+          <w:p>
+            <w:pPr>
+              <w:pStyle w:val="Compact"/>
+            </w:pPr>
+            <w:r>
+              <w:t xml:space="preserve">Metadata by fleet and country</w:t>
+            </w:r>
+          </w:p>
+        </w:tc>
+        <w:tc>
+          <w:tcPr/>
+          <w:p>
+            <w:pPr>
+              <w:pStyle w:val="Compact"/>
+            </w:pPr>
+            <w:r>
+              <w:t xml:space="preserve">Review fleet definitions, spatial coverage, observation level, and index construction by country and fishery.</w:t>
+            </w:r>
+          </w:p>
+        </w:tc>
+      </w:tr>
+      <w:tr>
+        <w:tc>
+          <w:tcPr/>
+          <w:p>
+            <w:pPr>
+              <w:pStyle w:val="Compact"/>
+            </w:pPr>
+            <w:r>
+              <w:t xml:space="preserve">2</w:t>
+            </w:r>
+          </w:p>
+        </w:tc>
+        <w:tc>
+          <w:tcPr/>
+          <w:p>
+            <w:pPr>
+              <w:pStyle w:val="Compact"/>
+            </w:pPr>
+            <w:r>
+              <w:t xml:space="preserve">Methods by fleet and country</w:t>
+            </w:r>
+          </w:p>
+        </w:tc>
+        <w:tc>
+          <w:tcPr/>
+          <w:p>
+            <w:pPr>
+              <w:pStyle w:val="Compact"/>
+            </w:pPr>
+            <w:r>
+              <w:t xml:space="preserve">Compare GLM, spatio-temporal models, GLMMs with spatio-temporal random effects, and latitude-longitude smoothing approaches.</w:t>
+            </w:r>
+          </w:p>
+        </w:tc>
+      </w:tr>
+      <w:tr>
+        <w:tc>
+          <w:tcPr/>
+          <w:p>
+            <w:pPr>
+              <w:pStyle w:val="Compact"/>
+            </w:pPr>
+            <w:r>
+              <w:t xml:space="preserve">3</w:t>
+            </w:r>
+          </w:p>
+        </w:tc>
+        <w:tc>
+          <w:tcPr/>
+          <w:p>
+            <w:pPr>
+              <w:pStyle w:val="Compact"/>
+            </w:pPr>
+            <w:r>
+              <w:t xml:space="preserve">Peruvian CPUE report</w:t>
+            </w:r>
+          </w:p>
+        </w:tc>
+        <w:tc>
+          <w:tcPr/>
+          <w:p>
+            <w:pPr>
+              <w:pStyle w:val="Compact"/>
+            </w:pPr>
+            <w:r>
+              <w:t xml:space="preserve">Present and discuss</w:t>
+            </w:r>
+            <w:r>
+              <w:t xml:space="preserve"> </w:t>
+            </w:r>
+            <w:r>
+              <w:rPr>
+                <w:i/>
+                <w:iCs/>
+              </w:rPr>
+              <w:t xml:space="preserve">Standardization of catch-per-unit-effort (CPUE) for jack mackerel (2015-2025) in Peruvian national jurisdictional waters</w:t>
+            </w:r>
+            <w:r>
+              <w:t xml:space="preserve"> </w:t>
+            </w:r>
+            <w:r>
+              <w:t xml:space="preserve">(Miran Geronimo and Gersson Roman).</w:t>
+            </w:r>
+          </w:p>
+        </w:tc>
+      </w:tr>
+      <w:tr>
+        <w:tc>
+          <w:tcPr/>
+          <w:p>
+            <w:pPr>
+              <w:pStyle w:val="Compact"/>
+            </w:pPr>
+            <w:r>
+              <w:t xml:space="preserve">4</w:t>
+            </w:r>
+          </w:p>
+        </w:tc>
+        <w:tc>
+          <w:tcPr/>
+          <w:p>
+            <w:pPr>
+              <w:pStyle w:val="Compact"/>
+            </w:pPr>
+            <w:r>
+              <w:t xml:space="preserve">Comparative analysis and parsimony across candidate indices</w:t>
+            </w:r>
+          </w:p>
+        </w:tc>
+        <w:tc>
+          <w:tcPr/>
+          <w:p>
+            <w:pPr>
+              <w:pStyle w:val="Compact"/>
+            </w:pPr>
+            <w:r>
+              <w:t xml:space="preserve">Evaluate traditional GLM, spatio-temporal, and environmentally informed approaches and identify the most suitable benchmark candidates.</w:t>
+            </w:r>
+          </w:p>
+        </w:tc>
+      </w:tr>
+      <w:tr>
+        <w:tc>
+          <w:tcPr/>
+          <w:p>
+            <w:pPr>
+              <w:pStyle w:val="Compact"/>
+            </w:pPr>
+            <w:r>
+              <w:t xml:space="preserve">5</w:t>
+            </w:r>
+          </w:p>
+        </w:tc>
+        <w:tc>
+          <w:tcPr/>
+          <w:p>
+            <w:pPr>
+              <w:pStyle w:val="Compact"/>
+            </w:pPr>
+            <w:r>
+              <w:t xml:space="preserve">Effort-creep review and decision for stock assessment use</w:t>
+            </w:r>
+          </w:p>
+        </w:tc>
+        <w:tc>
+          <w:tcPr/>
+          <w:p>
+            <w:pPr>
+              <w:pStyle w:val="Compact"/>
+            </w:pPr>
+            <w:r>
+              <w:t xml:space="preserve">Revisit current effort-creep assumptions and consider whether revised treatment is needed for benchmark runs.</w:t>
+            </w:r>
+          </w:p>
+        </w:tc>
+      </w:tr>
+      <w:tr>
+        <w:tc>
+          <w:tcPr/>
+          <w:p>
+            <w:pPr>
+              <w:pStyle w:val="Compact"/>
+            </w:pPr>
+            <w:r>
+              <w:t xml:space="preserve">6</w:t>
+            </w:r>
+          </w:p>
+        </w:tc>
+        <w:tc>
+          <w:tcPr/>
+          <w:p>
+            <w:pPr>
+              <w:pStyle w:val="Compact"/>
+            </w:pPr>
+            <w:r>
+              <w:t xml:space="preserve">Catchability-availability blocks by abundance index</w:t>
+            </w:r>
+          </w:p>
+        </w:tc>
+        <w:tc>
+          <w:tcPr/>
+          <w:p>
+            <w:pPr>
+              <w:pStyle w:val="Compact"/>
+            </w:pPr>
+            <w:r>
+              <w:t xml:space="preserve">Review evidence for temporal or spatial changes in availability, including possible El Niño effects and implications for</w:t>
+            </w:r>
+            <w:r>
+              <w:t xml:space="preserve"> </w:t>
+            </w:r>
+            <w:r>
+              <w:rPr>
+                <w:rStyle w:val="VerbatimChar"/>
+              </w:rPr>
+              <w:t xml:space="preserve">q</w:t>
+            </w:r>
+            <w:r>
+              <w:t xml:space="preserve"> </w:t>
+            </w:r>
+            <w:r>
+              <w:t xml:space="preserve">blocks.</w:t>
+            </w:r>
+          </w:p>
+        </w:tc>
+      </w:tr>
+      <w:tr>
+        <w:tc>
+          <w:tcPr/>
+          <w:p>
+            <w:pPr>
+              <w:pStyle w:val="Compact"/>
+            </w:pPr>
+            <w:r>
+              <w:t xml:space="preserve">7</w:t>
+            </w:r>
+          </w:p>
+        </w:tc>
+        <w:tc>
+          <w:tcPr/>
+          <w:p>
+            <w:pPr>
+              <w:pStyle w:val="Compact"/>
+            </w:pPr>
+            <w:r>
+              <w:t xml:space="preserve">CPUE weighting factors for stock assessment</w:t>
+            </w:r>
+          </w:p>
+        </w:tc>
+        <w:tc>
+          <w:tcPr/>
+          <w:p>
+            <w:pPr>
+              <w:pStyle w:val="Compact"/>
+            </w:pPr>
+            <w:r>
+              <w:t xml:space="preserve">Discuss weighting choices and how they affect assessment fits and benchmark comparisons.</w:t>
+            </w:r>
+          </w:p>
+        </w:tc>
+      </w:tr>
+      <w:tr>
+        <w:tc>
+          <w:tcPr/>
+          <w:p>
+            <w:pPr>
+              <w:pStyle w:val="Compact"/>
+            </w:pPr>
+            <w:r>
+              <w:t xml:space="preserve">8</w:t>
+            </w:r>
+          </w:p>
+        </w:tc>
+        <w:tc>
+          <w:tcPr/>
+          <w:p>
+            <w:pPr>
+              <w:pStyle w:val="Compact"/>
+            </w:pPr>
+            <w:r>
+              <w:t xml:space="preserve">Separate versus combined index products for HCR use</w:t>
+            </w:r>
+          </w:p>
+        </w:tc>
+        <w:tc>
+          <w:tcPr/>
+          <w:p>
+            <w:pPr>
+              <w:pStyle w:val="Compact"/>
+            </w:pPr>
+            <w:r>
+              <w:t xml:space="preserve">Consider whether the benchmark should retain separate series or define a combined CPUE product for OM conditioning and MP inputs.</w:t>
+            </w:r>
+          </w:p>
+        </w:tc>
+      </w:tr>
+    </w:tbl>
+    <w:bookmarkEnd w:id="14"/>
+    <w:bookmarkStart w:id="15" w:name="Xdddbf6479f3c4ab0ba51ce45a980492bec0f743"/>
+    <w:p>
+      <w:pPr>
+        <w:pStyle w:val="Heading2"/>
+      </w:pPr>
+      <w:r>
+        <w:t xml:space="preserve">Day 3. Recap, Report Drafting, and Biological Inputs</w:t>
+      </w:r>
+    </w:p>
+    <w:p>
+      <w:pPr>
+        <w:pStyle w:val="FirstParagraph"/>
+      </w:pPr>
+      <w:r>
+        <w:t xml:space="preserve">The morning session will be used to recap the Acoustic and CPUE sessions, identify</w:t>
+      </w:r>
+      <w:r>
+        <w:t xml:space="preserve"> </w:t>
+      </w:r>
+      <w:r>
+        <w:t xml:space="preserve">remaining loose ends, and begin drafting the corresponding report sections. The</w:t>
+      </w:r>
+      <w:r>
+        <w:t xml:space="preserve"> </w:t>
+      </w:r>
+      <w:r>
+        <w:t xml:space="preserve">objective is to document decisions, unresolved technical issues, and follow-up</w:t>
+      </w:r>
+      <w:r>
+        <w:t xml:space="preserve"> </w:t>
+      </w:r>
+      <w:r>
+        <w:t xml:space="preserve">tasks while the index discussions are still current.</w:t>
+      </w:r>
+    </w:p>
+    <w:p>
+      <w:pPr>
+        <w:pStyle w:val="BodyText"/>
+      </w:pPr>
+      <w:r>
+        <w:t xml:space="preserve">The afternoon session will begin with a summary of SCW16-Doc01 and its</w:t>
+      </w:r>
+      <w:r>
+        <w:t xml:space="preserve"> </w:t>
+      </w:r>
+      <w:r>
+        <w:t xml:space="preserve">implications for benchmark and MSE development. This will be followed by a</w:t>
+      </w:r>
+      <w:r>
+        <w:t xml:space="preserve"> </w:t>
+      </w:r>
+      <w:r>
+        <w:t xml:space="preserve">review of the biological assumptions used in the assessment and operating-model</w:t>
+      </w:r>
+      <w:r>
+        <w:t xml:space="preserve"> </w:t>
+      </w:r>
+      <w:r>
+        <w:t xml:space="preserve">conditioning, including growth, maturity, natural mortality, weight-at-age,</w:t>
+      </w:r>
+      <w:r>
+        <w:t xml:space="preserve"> </w:t>
+      </w:r>
+      <w:r>
+        <w:t xml:space="preserve">stock structure, and recruitment-productivity assumptions. The discussion should</w:t>
+      </w:r>
+      <w:r>
+        <w:t xml:space="preserve"> </w:t>
+      </w:r>
+      <w:r>
+        <w:t xml:space="preserve">identify options for refining model runs and for defining a compact set of</w:t>
+      </w:r>
+      <w:r>
+        <w:t xml:space="preserve"> </w:t>
+      </w:r>
+      <w:r>
+        <w:t xml:space="preserve">assessment and OM alternatives for further evaluation.</w:t>
+      </w:r>
+    </w:p>
+    <w:p>
+      <w:pPr>
+        <w:pStyle w:val="BodyText"/>
+      </w:pPr>
+      <w:r>
+        <w:t xml:space="preserve">The Peruvian delegation has requested time during the biological-inputs session</w:t>
+      </w:r>
+      <w:r>
+        <w:t xml:space="preserve"> </w:t>
+      </w:r>
+      <w:r>
+        <w:t xml:space="preserve">for the report</w:t>
+      </w:r>
+      <w:r>
+        <w:t xml:space="preserve"> </w:t>
+      </w:r>
+      <w:r>
+        <w:rPr>
+          <w:i/>
+          <w:iCs/>
+        </w:rPr>
+        <w:t xml:space="preserve">Technical report on the updated length-frequency data of the</w:t>
+      </w:r>
+      <w:r>
+        <w:rPr>
+          <w:i/>
+          <w:iCs/>
+        </w:rPr>
+        <w:t xml:space="preserve"> </w:t>
+      </w:r>
+      <w:r>
+        <w:rPr>
+          <w:i/>
+          <w:iCs/>
+        </w:rPr>
+        <w:t xml:space="preserve">Peruvian jack mackerel (Trachurus murphyi) stock in national jurisdictional</w:t>
+      </w:r>
+      <w:r>
+        <w:rPr>
+          <w:i/>
+          <w:iCs/>
+        </w:rPr>
+        <w:t xml:space="preserve"> </w:t>
+      </w:r>
+      <w:r>
+        <w:rPr>
+          <w:i/>
+          <w:iCs/>
+        </w:rPr>
+        <w:t xml:space="preserve">waters</w:t>
+      </w:r>
+      <w:r>
+        <w:t xml:space="preserve"> </w:t>
+      </w:r>
+      <w:r>
+        <w:t xml:space="preserve">(Criscely Luján and Gersson Roman).</w:t>
+      </w:r>
+    </w:p>
+    <w:p>
+      <w:pPr>
+        <w:pStyle w:val="BodyText"/>
+      </w:pPr>
+      <w:r>
+        <w:t xml:space="preserve">Additional Peruvian reports noted for the benchmark workshop are:</w:t>
+      </w:r>
+    </w:p>
+    <w:p>
+      <w:pPr>
+        <w:pStyle w:val="Compact"/>
+        <w:numPr>
+          <w:ilvl w:val="0"/>
+          <w:numId w:val="1002"/>
+        </w:numPr>
+      </w:pPr>
+      <w:r>
+        <w:rPr>
+          <w:i/>
+          <w:iCs/>
+        </w:rPr>
+        <w:t xml:space="preserve">Length-weight relationship of jack mackerel (Trachurus murphyi) in Peru and</w:t>
+      </w:r>
+      <w:r>
+        <w:rPr>
+          <w:i/>
+          <w:iCs/>
+        </w:rPr>
+        <w:t xml:space="preserve"> </w:t>
+      </w:r>
+      <w:r>
+        <w:rPr>
+          <w:i/>
+          <w:iCs/>
+        </w:rPr>
+        <w:t xml:space="preserve">its implications for biomass estimation</w:t>
+      </w:r>
+      <w:r>
+        <w:t xml:space="preserve"> </w:t>
+      </w:r>
+      <w:r>
+        <w:t xml:space="preserve">(Sandra Cahuin, Ana Alegre and Marilú</w:t>
+      </w:r>
+      <w:r>
+        <w:t xml:space="preserve"> </w:t>
+      </w:r>
+      <w:r>
+        <w:t xml:space="preserve">Bouchon).</w:t>
+      </w:r>
+    </w:p>
+    <w:p>
+      <w:pPr>
+        <w:pStyle w:val="Compact"/>
+        <w:numPr>
+          <w:ilvl w:val="0"/>
+          <w:numId w:val="1002"/>
+        </w:numPr>
+      </w:pPr>
+      <w:r>
+        <w:rPr>
+          <w:i/>
+          <w:iCs/>
+        </w:rPr>
+        <w:t xml:space="preserve">Considerations on the use of the jack mackerel acoustic index in Peruvian</w:t>
+      </w:r>
+      <w:r>
+        <w:rPr>
+          <w:i/>
+          <w:iCs/>
+        </w:rPr>
+        <w:t xml:space="preserve"> </w:t>
+      </w:r>
+      <w:r>
+        <w:rPr>
+          <w:i/>
+          <w:iCs/>
+        </w:rPr>
+        <w:t xml:space="preserve">national jurisdictional waters</w:t>
+      </w:r>
+      <w:r>
+        <w:t xml:space="preserve"> </w:t>
+      </w:r>
+      <w:r>
+        <w:t xml:space="preserve">(Gersson Roman, Sandra Cahuin and Marilú</w:t>
+      </w:r>
+      <w:r>
+        <w:t xml:space="preserve"> </w:t>
+      </w:r>
+      <w:r>
+        <w:t xml:space="preserve">Bouchon).</w:t>
+      </w:r>
+    </w:p>
+    <w:tbl>
+      <w:tblPr>
+        <w:tblStyle w:val="Table"/>
+        <w:tblW w:type="pct" w:w="5000"/>
+        <w:tblLayout w:type="fixed"/>
+        <w:tblLook w:firstRow="1" w:lastRow="0" w:firstColumn="0" w:lastColumn="0" w:noHBand="0" w:noVBand="0" w:val="0020"/>
+      </w:tblPr>
+      <w:tblGrid>
+        <w:gridCol w:w="2640"/>
+        <w:gridCol w:w="2640"/>
+        <w:gridCol w:w="2640"/>
+      </w:tblGrid>
+      <w:tr>
+        <w:trPr>
+          <w:tblHeader w:val="on"/>
+        </w:trPr>
+        <w:tc>
+          <w:tcPr/>
+          <w:p>
+            <w:pPr>
+              <w:pStyle w:val="Compact"/>
+            </w:pPr>
+            <w:r>
               <w:t xml:space="preserve">Session</w:t>
             </w:r>
           </w:p>
@@ -1396,7 +1635,7 @@
               <w:pStyle w:val="Compact"/>
             </w:pPr>
             <w:r>
-              <w:t xml:space="preserve">Review assessment simplification results, biological assumptions, and options for refined model runs.</w:t>
+              <w:t xml:space="preserve">Review assessment simplification results, biological assumptions, and options for refined model runs. Include the Peruvian length-frequency data report by Criscely Luján and Gersson Roman.</w:t>
             </w:r>
           </w:p>
         </w:tc>
@@ -1960,6 +2199,9 @@
     <w:abstractNumId w:val="990"/>
   </w:num>
   <w:num w:numId="1001">
+    <w:abstractNumId w:val="991"/>
+  </w:num>
+  <w:num w:numId="1002">
     <w:abstractNumId w:val="991"/>
   </w:num>
 </w:numbering>

</xml_diff>

<commit_message>
Update Doc00 Monday opening agenda
</commit_message>
<xml_diff>
--- a/docs/SCW16-Doc00.docx
+++ b/docs/SCW16-Doc00.docx
@@ -84,7 +84,7 @@
         <w:t xml:space="preserve">Erich Diaz, Ignacio Payá, José Zenteno, Sebastián Vásquez, and Niels Hintzen.</w:t>
       </w:r>
     </w:p>
-    <w:bookmarkStart w:id="12" w:name="X3c14e84487627fe36a19ff569c774c2d12c20b1"/>
+    <w:bookmarkStart w:id="13" w:name="X3c14e84487627fe36a19ff569c774c2d12c20b1"/>
     <w:p>
       <w:pPr>
         <w:pStyle w:val="Heading2"/>
@@ -115,7 +115,219 @@
         <w:t xml:space="preserve">09:00</w:t>
       </w:r>
     </w:p>
-    <w:bookmarkStart w:id="9" w:name="session-1"/>
+    <w:p>
+      <w:pPr>
+        <w:pStyle w:val="Compact"/>
+        <w:numPr>
+          <w:ilvl w:val="0"/>
+          <w:numId w:val="1001"/>
+        </w:numPr>
+      </w:pPr>
+      <w:r>
+        <w:rPr>
+          <w:b/>
+          <w:bCs/>
+        </w:rPr>
+        <w:t xml:space="preserve">Date:</w:t>
+      </w:r>
+      <w:r>
+        <w:t xml:space="preserve"> </w:t>
+      </w:r>
+      <w:r>
+        <w:t xml:space="preserve">Monday, 18 May 2026</w:t>
+      </w:r>
+    </w:p>
+    <w:p>
+      <w:pPr>
+        <w:pStyle w:val="Compact"/>
+        <w:numPr>
+          <w:ilvl w:val="0"/>
+          <w:numId w:val="1001"/>
+        </w:numPr>
+      </w:pPr>
+      <w:r>
+        <w:rPr>
+          <w:b/>
+          <w:bCs/>
+        </w:rPr>
+        <w:t xml:space="preserve">Note:</w:t>
+      </w:r>
+      <w:r>
+        <w:t xml:space="preserve"> </w:t>
+      </w:r>
+      <w:r>
+        <w:t xml:space="preserve">The morning coffee break is scheduled early on Day 1 only. For the</w:t>
+      </w:r>
+      <w:r>
+        <w:t xml:space="preserve"> </w:t>
+      </w:r>
+      <w:r>
+        <w:t xml:space="preserve">rest of the week, the morning coffee break is expected at 10:30.</w:t>
+      </w:r>
+    </w:p>
+    <w:bookmarkStart w:id="9" w:name="opening"/>
+    <w:p>
+      <w:pPr>
+        <w:pStyle w:val="Heading3"/>
+      </w:pPr>
+      <w:r>
+        <w:t xml:space="preserve">Opening</w:t>
+      </w:r>
+    </w:p>
+    <w:tbl>
+      <w:tblPr>
+        <w:tblStyle w:val="Table"/>
+        <w:tblW w:type="auto" w:w="0"/>
+        <w:tblLook w:firstRow="1" w:lastRow="0" w:firstColumn="0" w:lastColumn="0" w:noHBand="0" w:noVBand="0" w:val="0020"/>
+      </w:tblPr>
+      <w:tblGrid>
+        <w:gridCol w:w="2640"/>
+        <w:gridCol w:w="2640"/>
+        <w:gridCol w:w="2640"/>
+      </w:tblGrid>
+      <w:tr>
+        <w:trPr>
+          <w:tblHeader w:val="on"/>
+        </w:trPr>
+        <w:tc>
+          <w:tcPr/>
+          <w:p>
+            <w:pPr>
+              <w:pStyle w:val="Compact"/>
+            </w:pPr>
+            <w:r>
+              <w:t xml:space="preserve">Time</w:t>
+            </w:r>
+          </w:p>
+        </w:tc>
+        <w:tc>
+          <w:tcPr/>
+          <w:p>
+            <w:pPr>
+              <w:pStyle w:val="Compact"/>
+            </w:pPr>
+            <w:r>
+              <w:t xml:space="preserve">Topic</w:t>
+            </w:r>
+          </w:p>
+        </w:tc>
+        <w:tc>
+          <w:tcPr/>
+          <w:p>
+            <w:pPr>
+              <w:pStyle w:val="Compact"/>
+            </w:pPr>
+            <w:r>
+              <w:t xml:space="preserve">Presenter</w:t>
+            </w:r>
+          </w:p>
+        </w:tc>
+      </w:tr>
+      <w:tr>
+        <w:tc>
+          <w:tcPr/>
+          <w:p>
+            <w:pPr>
+              <w:pStyle w:val="Compact"/>
+            </w:pPr>
+            <w:r>
+              <w:t xml:space="preserve">09:00-09:20</w:t>
+            </w:r>
+          </w:p>
+        </w:tc>
+        <w:tc>
+          <w:tcPr/>
+          <w:p>
+            <w:pPr>
+              <w:pStyle w:val="Compact"/>
+            </w:pPr>
+            <w:r>
+              <w:t xml:space="preserve">Opening Ceremony</w:t>
+            </w:r>
+          </w:p>
+        </w:tc>
+        <w:tc>
+          <w:tcPr/>
+          <w:p>
+            <w:pPr>
+              <w:pStyle w:val="Compact"/>
+            </w:pPr>
+            <w:r>
+              <w:t xml:space="preserve">Executive President of IMARPE</w:t>
+            </w:r>
+          </w:p>
+        </w:tc>
+      </w:tr>
+      <w:tr>
+        <w:tc>
+          <w:tcPr/>
+          <w:p>
+            <w:pPr>
+              <w:pStyle w:val="Compact"/>
+            </w:pPr>
+            <w:r>
+              <w:t xml:space="preserve">09:20-09:30</w:t>
+            </w:r>
+          </w:p>
+        </w:tc>
+        <w:tc>
+          <w:tcPr/>
+          <w:p>
+            <w:pPr>
+              <w:pStyle w:val="Compact"/>
+            </w:pPr>
+            <w:r>
+              <w:t xml:space="preserve">Official Photo</w:t>
+            </w:r>
+          </w:p>
+        </w:tc>
+        <w:tc>
+          <w:tcPr/>
+          <w:p>
+            <w:pPr>
+              <w:pStyle w:val="Compact"/>
+            </w:pPr>
+            <w:r>
+              <w:t xml:space="preserve">All participants</w:t>
+            </w:r>
+          </w:p>
+        </w:tc>
+      </w:tr>
+      <w:tr>
+        <w:tc>
+          <w:tcPr/>
+          <w:p>
+            <w:pPr>
+              <w:pStyle w:val="Compact"/>
+            </w:pPr>
+            <w:r>
+              <w:t xml:space="preserve">09:30-09:45</w:t>
+            </w:r>
+          </w:p>
+        </w:tc>
+        <w:tc>
+          <w:tcPr/>
+          <w:p>
+            <w:pPr>
+              <w:pStyle w:val="Compact"/>
+            </w:pPr>
+            <w:r>
+              <w:t xml:space="preserve">Coffee break</w:t>
+            </w:r>
+          </w:p>
+        </w:tc>
+        <w:tc>
+          <w:tcPr/>
+          <w:p>
+            <w:pPr>
+              <w:pStyle w:val="Compact"/>
+            </w:pPr>
+          </w:p>
+        </w:tc>
+      </w:tr>
+    </w:tbl>
+    <w:bookmarkEnd w:id="9"/>
+    <w:bookmarkStart w:id="10" w:name="session-1"/>
     <w:p>
       <w:pPr>
         <w:pStyle w:val="Heading3"/>
@@ -182,7 +394,7 @@
               <w:pStyle w:val="Compact"/>
             </w:pPr>
             <w:r>
-              <w:t xml:space="preserve">09:00-09:20</w:t>
+              <w:t xml:space="preserve">09:45-10:05</w:t>
             </w:r>
           </w:p>
         </w:tc>
@@ -217,7 +429,7 @@
               <w:pStyle w:val="Compact"/>
             </w:pPr>
             <w:r>
-              <w:t xml:space="preserve">09:20-09:40</w:t>
+              <w:t xml:space="preserve">10:05-10:25</w:t>
             </w:r>
           </w:p>
         </w:tc>
@@ -252,7 +464,7 @@
               <w:pStyle w:val="Compact"/>
             </w:pPr>
             <w:r>
-              <w:t xml:space="preserve">09:40-10:00</w:t>
+              <w:t xml:space="preserve">10:25-10:45</w:t>
             </w:r>
           </w:p>
         </w:tc>
@@ -287,7 +499,7 @@
               <w:pStyle w:val="Compact"/>
             </w:pPr>
             <w:r>
-              <w:t xml:space="preserve">10:00-10:20</w:t>
+              <w:t xml:space="preserve">10:45-11:05</w:t>
             </w:r>
           </w:p>
         </w:tc>
@@ -331,39 +543,7 @@
               <w:pStyle w:val="Compact"/>
             </w:pPr>
             <w:r>
-              <w:t xml:space="preserve">10:20-10:40</w:t>
-            </w:r>
-          </w:p>
-        </w:tc>
-        <w:tc>
-          <w:tcPr/>
-          <w:p>
-            <w:pPr>
-              <w:pStyle w:val="Compact"/>
-            </w:pPr>
-            <w:r>
-              <w:t xml:space="preserve">Coffee break</w:t>
-            </w:r>
-          </w:p>
-        </w:tc>
-        <w:tc>
-          <w:tcPr/>
-          <w:p>
-            <w:pPr>
-              <w:pStyle w:val="Compact"/>
-            </w:pPr>
-          </w:p>
-        </w:tc>
-      </w:tr>
-      <w:tr>
-        <w:tc>
-          <w:tcPr/>
-          <w:p>
-            <w:pPr>
-              <w:pStyle w:val="Compact"/>
-            </w:pPr>
-            <w:r>
-              <w:t xml:space="preserve">10:40-11:00</w:t>
+              <w:t xml:space="preserve">11:05-11:25</w:t>
             </w:r>
           </w:p>
         </w:tc>
@@ -398,7 +578,7 @@
               <w:pStyle w:val="Compact"/>
             </w:pPr>
             <w:r>
-              <w:t xml:space="preserve">11:00-11:20</w:t>
+              <w:t xml:space="preserve">11:25-11:45</w:t>
             </w:r>
           </w:p>
         </w:tc>
@@ -433,7 +613,7 @@
               <w:pStyle w:val="Compact"/>
             </w:pPr>
             <w:r>
-              <w:t xml:space="preserve">11:20-11:40</w:t>
+              <w:t xml:space="preserve">11:45-12:05</w:t>
             </w:r>
           </w:p>
         </w:tc>
@@ -461,8 +641,8 @@
         </w:tc>
       </w:tr>
     </w:tbl>
-    <w:bookmarkEnd w:id="9"/>
-    <w:bookmarkStart w:id="10" w:name="session-2"/>
+    <w:bookmarkEnd w:id="10"/>
+    <w:bookmarkStart w:id="11" w:name="session-2"/>
     <w:p>
       <w:pPr>
         <w:pStyle w:val="Heading3"/>
@@ -529,7 +709,7 @@
               <w:pStyle w:val="Compact"/>
             </w:pPr>
             <w:r>
-              <w:t xml:space="preserve">11:40-12:00</w:t>
+              <w:t xml:space="preserve">12:05-12:25</w:t>
             </w:r>
           </w:p>
         </w:tc>
@@ -564,7 +744,39 @@
               <w:pStyle w:val="Compact"/>
             </w:pPr>
             <w:r>
-              <w:t xml:space="preserve">12:20-12:40</w:t>
+              <w:t xml:space="preserve">12:30-14:00</w:t>
+            </w:r>
+          </w:p>
+        </w:tc>
+        <w:tc>
+          <w:tcPr/>
+          <w:p>
+            <w:pPr>
+              <w:pStyle w:val="Compact"/>
+            </w:pPr>
+            <w:r>
+              <w:t xml:space="preserve">Lunch break</w:t>
+            </w:r>
+          </w:p>
+        </w:tc>
+        <w:tc>
+          <w:tcPr/>
+          <w:p>
+            <w:pPr>
+              <w:pStyle w:val="Compact"/>
+            </w:pPr>
+          </w:p>
+        </w:tc>
+      </w:tr>
+      <w:tr>
+        <w:tc>
+          <w:tcPr/>
+          <w:p>
+            <w:pPr>
+              <w:pStyle w:val="Compact"/>
+            </w:pPr>
+            <w:r>
+              <w:t xml:space="preserve">14:00-14:20</w:t>
             </w:r>
           </w:p>
         </w:tc>
@@ -591,41 +803,9 @@
           </w:p>
         </w:tc>
       </w:tr>
-      <w:tr>
-        <w:tc>
-          <w:tcPr/>
-          <w:p>
-            <w:pPr>
-              <w:pStyle w:val="Compact"/>
-            </w:pPr>
-            <w:r>
-              <w:t xml:space="preserve">12:40-14:00</w:t>
-            </w:r>
-          </w:p>
-        </w:tc>
-        <w:tc>
-          <w:tcPr/>
-          <w:p>
-            <w:pPr>
-              <w:pStyle w:val="Compact"/>
-            </w:pPr>
-            <w:r>
-              <w:t xml:space="preserve">Lunch break (1 hour 40 minutes)</w:t>
-            </w:r>
-          </w:p>
-        </w:tc>
-        <w:tc>
-          <w:tcPr/>
-          <w:p>
-            <w:pPr>
-              <w:pStyle w:val="Compact"/>
-            </w:pPr>
-          </w:p>
-        </w:tc>
-      </w:tr>
     </w:tbl>
-    <w:bookmarkEnd w:id="10"/>
-    <w:bookmarkStart w:id="11" w:name="session-3"/>
+    <w:bookmarkEnd w:id="11"/>
+    <w:bookmarkStart w:id="12" w:name="session-3"/>
     <w:p>
       <w:pPr>
         <w:pStyle w:val="Heading3"/>
@@ -692,7 +872,7 @@
               <w:pStyle w:val="Compact"/>
             </w:pPr>
             <w:r>
-              <w:t xml:space="preserve">14:00-15:00</w:t>
+              <w:t xml:space="preserve">14:20-15:15</w:t>
             </w:r>
           </w:p>
         </w:tc>
@@ -727,7 +907,7 @@
               <w:pStyle w:val="Compact"/>
             </w:pPr>
             <w:r>
-              <w:t xml:space="preserve">15:00-15:20</w:t>
+              <w:t xml:space="preserve">15:15-15:35</w:t>
             </w:r>
           </w:p>
         </w:tc>
@@ -759,7 +939,7 @@
               <w:pStyle w:val="Compact"/>
             </w:pPr>
             <w:r>
-              <w:t xml:space="preserve">15:20-16:20</w:t>
+              <w:t xml:space="preserve">15:35-16:25</w:t>
             </w:r>
           </w:p>
         </w:tc>
@@ -794,7 +974,7 @@
               <w:pStyle w:val="Compact"/>
             </w:pPr>
             <w:r>
-              <w:t xml:space="preserve">16:20-17:00</w:t>
+              <w:t xml:space="preserve">16:25-17:00</w:t>
             </w:r>
           </w:p>
         </w:tc>
@@ -822,9 +1002,9 @@
         </w:tc>
       </w:tr>
     </w:tbl>
-    <w:bookmarkEnd w:id="11"/>
     <w:bookmarkEnd w:id="12"/>
-    <w:bookmarkStart w:id="14" w:name="X714c2cb5fc0ded1c3db2bdb64c8d0ee6121c99c"/>
+    <w:bookmarkEnd w:id="13"/>
+    <w:bookmarkStart w:id="15" w:name="X714c2cb5fc0ded1c3db2bdb64c8d0ee6121c99c"/>
     <w:p>
       <w:pPr>
         <w:pStyle w:val="Heading2"/>
@@ -832,7 +1012,7 @@
       <w:r>
         <w:t xml:space="preserve">Day 2. Preliminary CPUE Session Agenda (</w:t>
       </w:r>
-      <w:hyperlink r:id="rId13">
+      <w:hyperlink r:id="rId14">
         <w:r>
           <w:rPr>
             <w:rStyle w:val="Hyperlink"/>
@@ -866,7 +1046,7 @@
       <w:r>
         <w:t xml:space="preserve"> </w:t>
       </w:r>
-      <w:hyperlink r:id="rId13">
+      <w:hyperlink r:id="rId14">
         <w:r>
           <w:rPr>
             <w:rStyle w:val="Hyperlink"/>
@@ -1290,8 +1470,8 @@
         </w:tc>
       </w:tr>
     </w:tbl>
-    <w:bookmarkEnd w:id="14"/>
-    <w:bookmarkStart w:id="15" w:name="Xdddbf6479f3c4ab0ba51ce45a980492bec0f743"/>
+    <w:bookmarkEnd w:id="15"/>
+    <w:bookmarkStart w:id="16" w:name="Xdddbf6479f3c4ab0ba51ce45a980492bec0f743"/>
     <w:p>
       <w:pPr>
         <w:pStyle w:val="Heading2"/>
@@ -1641,8 +1821,8 @@
         </w:tc>
       </w:tr>
     </w:tbl>
-    <w:bookmarkEnd w:id="15"/>
-    <w:bookmarkStart w:id="16" w:name="Xff1c17e19db480750123204ba998bf160cd477b"/>
+    <w:bookmarkEnd w:id="16"/>
+    <w:bookmarkStart w:id="17" w:name="Xff1c17e19db480750123204ba998bf160cd477b"/>
     <w:p>
       <w:pPr>
         <w:pStyle w:val="Heading2"/>
@@ -1830,8 +2010,8 @@
         </w:tc>
       </w:tr>
     </w:tbl>
-    <w:bookmarkEnd w:id="16"/>
-    <w:bookmarkStart w:id="17" w:name="X8de8fe1d907eaae9c1bb1b7a5cd9ab8dee6c6d4"/>
+    <w:bookmarkEnd w:id="17"/>
+    <w:bookmarkStart w:id="18" w:name="X8de8fe1d907eaae9c1bb1b7a5cd9ab8dee6c6d4"/>
     <w:p>
       <w:pPr>
         <w:pStyle w:val="Heading2"/>
@@ -1981,7 +2161,7 @@
         </w:tc>
       </w:tr>
     </w:tbl>
-    <w:bookmarkEnd w:id="17"/>
+    <w:bookmarkEnd w:id="18"/>
     <w:sectPr>
       <w:footnotePr>
         <w:numRestart w:val="eachSect"/>

</xml_diff>

<commit_message>
Add SCW16 document references to agenda notes
</commit_message>
<xml_diff>
--- a/docs/SCW16-Doc00.docx
+++ b/docs/SCW16-Doc00.docx
@@ -1223,7 +1223,7 @@
               <w:pStyle w:val="Compact"/>
             </w:pPr>
             <w:r>
-              <w:t xml:space="preserve">Compare GLM, spatio-temporal models, GLMMs with spatio-temporal random effects, and latitude-longitude smoothing approaches.</w:t>
+              <w:t xml:space="preserve">Compare GLM, spatio-temporal models, GLMMs with spatio-temporal random effects, and latitude-longitude smoothing approaches, including SCW16-Doc10 and SCW16-Doc12.</w:t>
             </w:r>
           </w:p>
         </w:tc>
@@ -1309,7 +1309,7 @@
               <w:pStyle w:val="Compact"/>
             </w:pPr>
             <w:r>
-              <w:t xml:space="preserve">Evaluate traditional GLM, spatio-temporal, and environmentally informed approaches and identify the most suitable benchmark candidates.</w:t>
+              <w:t xml:space="preserve">Evaluate traditional GLM, spatio-temporal, and environmentally informed approaches and identify the most suitable benchmark candidates, informed by SCW16-Doc03.</w:t>
             </w:r>
           </w:p>
         </w:tc>
@@ -1344,7 +1344,7 @@
               <w:pStyle w:val="Compact"/>
             </w:pPr>
             <w:r>
-              <w:t xml:space="preserve">Revisit current effort-creep assumptions and consider whether revised treatment is needed for benchmark runs.</w:t>
+              <w:t xml:space="preserve">Revisit current effort-creep assumptions and consider whether revised treatment is needed for benchmark runs, including SCW16-Doc07.</w:t>
             </w:r>
           </w:p>
         </w:tc>
@@ -1780,7 +1780,7 @@
               <w:pStyle w:val="Compact"/>
             </w:pPr>
             <w:r>
-              <w:t xml:space="preserve">Summarize key conclusions, outstanding questions, and text needed for the workshop report.</w:t>
+              <w:t xml:space="preserve">Summarize key conclusions, outstanding questions, and text needed for the workshop report. Include SCW16-Doc11 catch/fishery data quality checks where they affect benchmark inputs or follow-up tasks.</w:t>
             </w:r>
           </w:p>
         </w:tc>
@@ -1815,7 +1815,7 @@
               <w:pStyle w:val="Compact"/>
             </w:pPr>
             <w:r>
-              <w:t xml:space="preserve">Review assessment simplification results, biological assumptions, and options for refined model runs. Include the Peruvian length-frequency data report by Criscely Luján and Gersson Roman.</w:t>
+              <w:t xml:space="preserve">Review assessment simplification results, biological assumptions, and options for refined model runs. Include SCW16-Doc05/JM_Biology and the Peruvian length-frequency data report by Criscely Luján and Gersson Roman.</w:t>
             </w:r>
           </w:p>
         </w:tc>
@@ -2004,7 +2004,7 @@
               <w:pStyle w:val="Compact"/>
             </w:pPr>
             <w:r>
-              <w:t xml:space="preserve">Define candidate OM specifications and document MCMC diagnostics, feasibility, and technical constraints.</w:t>
+              <w:t xml:space="preserve">Define candidate OM specifications and document MCMC diagnostics, feasibility, and technical constraints, including SCW16-Doc04.</w:t>
             </w:r>
           </w:p>
         </w:tc>

</xml_diff>

<commit_message>
Add Peru biological input reports to SCW16 agenda
</commit_message>
<xml_diff>
--- a/docs/SCW16-Doc00.docx
+++ b/docs/SCW16-Doc00.docx
@@ -1471,7 +1471,7 @@
       </w:tr>
     </w:tbl>
     <w:bookmarkEnd w:id="15"/>
-    <w:bookmarkStart w:id="16" w:name="Xdddbf6479f3c4ab0ba51ce45a980492bec0f743"/>
+    <w:bookmarkStart w:id="18" w:name="Xdddbf6479f3c4ab0ba51ce45a980492bec0f743"/>
     <w:p>
       <w:pPr>
         <w:pStyle w:val="Heading2"/>
@@ -1561,7 +1561,21 @@
         <w:t xml:space="preserve"> </w:t>
       </w:r>
       <w:r>
-        <w:t xml:space="preserve">for the report</w:t>
+        <w:t xml:space="preserve">for</w:t>
+      </w:r>
+      <w:r>
+        <w:t xml:space="preserve"> </w:t>
+      </w:r>
+      <w:hyperlink r:id="rId16">
+        <w:r>
+          <w:rPr>
+            <w:rStyle w:val="Hyperlink"/>
+          </w:rPr>
+          <w:t xml:space="preserve">SCW16-Doc14</w:t>
+        </w:r>
+      </w:hyperlink>
+      <w:r>
+        <w:t xml:space="preserve">,</w:t>
       </w:r>
       <w:r>
         <w:t xml:space="preserve"> </w:t>
@@ -1571,7 +1585,7 @@
           <w:i/>
           <w:iCs/>
         </w:rPr>
-        <w:t xml:space="preserve">Technical report on the updated length-frequency data of the</w:t>
+        <w:t xml:space="preserve">Technical report on</w:t>
       </w:r>
       <w:r>
         <w:rPr>
@@ -1585,7 +1599,7 @@
           <w:i/>
           <w:iCs/>
         </w:rPr>
-        <w:t xml:space="preserve">Peruvian jack mackerel (Trachurus murphyi) stock in national jurisdictional</w:t>
+        <w:t xml:space="preserve">the updated length-frequency data for the Peruvian jack mackerel stock</w:t>
       </w:r>
       <w:r>
         <w:rPr>
@@ -1599,13 +1613,19 @@
           <w:i/>
           <w:iCs/>
         </w:rPr>
-        <w:t xml:space="preserve">waters</w:t>
-      </w:r>
-      <w:r>
-        <w:t xml:space="preserve"> </w:t>
-      </w:r>
-      <w:r>
-        <w:t xml:space="preserve">(Criscely Luján and Gersson Roman).</w:t>
+        <w:t xml:space="preserve">(far-north stock) in Peruvian jurisdictional waters</w:t>
+      </w:r>
+      <w:r>
+        <w:t xml:space="preserve"> </w:t>
+      </w:r>
+      <w:r>
+        <w:t xml:space="preserve">(Criscely Luján and Gersson</w:t>
+      </w:r>
+      <w:r>
+        <w:t xml:space="preserve"> </w:t>
+      </w:r>
+      <w:r>
+        <w:t xml:space="preserve">Roman).</w:t>
       </w:r>
     </w:p>
     <w:p>
@@ -1624,12 +1644,26 @@
           <w:numId w:val="1002"/>
         </w:numPr>
       </w:pPr>
+      <w:hyperlink r:id="rId17">
+        <w:r>
+          <w:rPr>
+            <w:rStyle w:val="Hyperlink"/>
+          </w:rPr>
+          <w:t xml:space="preserve">SCW16-Doc13</w:t>
+        </w:r>
+      </w:hyperlink>
+      <w:r>
+        <w:t xml:space="preserve">,</w:t>
+      </w:r>
+      <w:r>
+        <w:t xml:space="preserve"> </w:t>
+      </w:r>
       <w:r>
         <w:rPr>
           <w:i/>
           <w:iCs/>
         </w:rPr>
-        <w:t xml:space="preserve">Length-weight relationship of jack mackerel (Trachurus murphyi) in Peru and</w:t>
+        <w:t xml:space="preserve">Length-weight relationship</w:t>
       </w:r>
       <w:r>
         <w:rPr>
@@ -1643,19 +1677,27 @@
           <w:i/>
           <w:iCs/>
         </w:rPr>
-        <w:t xml:space="preserve">its implications for biomass estimation</w:t>
-      </w:r>
-      <w:r>
-        <w:t xml:space="preserve"> </w:t>
-      </w:r>
-      <w:r>
-        <w:t xml:space="preserve">(Sandra Cahuin, Ana Alegre and Marilú</w:t>
-      </w:r>
-      <w:r>
-        <w:t xml:space="preserve"> </w:t>
-      </w:r>
-      <w:r>
-        <w:t xml:space="preserve">Bouchon).</w:t>
+        <w:t xml:space="preserve">of jack mackerel (Trachurus murphyi) in Peru and its implications for biomass</w:t>
+      </w:r>
+      <w:r>
+        <w:rPr>
+          <w:i/>
+          <w:iCs/>
+        </w:rPr>
+        <w:t xml:space="preserve"> </w:t>
+      </w:r>
+      <w:r>
+        <w:rPr>
+          <w:i/>
+          <w:iCs/>
+        </w:rPr>
+        <w:t xml:space="preserve">estimation</w:t>
+      </w:r>
+      <w:r>
+        <w:t xml:space="preserve"> </w:t>
+      </w:r>
+      <w:r>
+        <w:t xml:space="preserve">(Sandra Cahuin, Ana Alegre and Marilú Bouchon).</w:t>
       </w:r>
     </w:p>
     <w:p>
@@ -1815,14 +1857,14 @@
               <w:pStyle w:val="Compact"/>
             </w:pPr>
             <w:r>
-              <w:t xml:space="preserve">Review assessment simplification results, biological assumptions, and options for refined model runs. Include SCW16-Doc05/JM_Biology and the Peruvian length-frequency data report by Criscely Luján and Gersson Roman.</w:t>
+              <w:t xml:space="preserve">Review assessment simplification results, biological assumptions, and options for refined model runs. Include SCW16-Doc05/JM_Biology, SCW16-Doc13 Peru length-weight, and SCW16-Doc14 Peru length-frequency.</w:t>
             </w:r>
           </w:p>
         </w:tc>
       </w:tr>
     </w:tbl>
-    <w:bookmarkEnd w:id="16"/>
-    <w:bookmarkStart w:id="17" w:name="Xff1c17e19db480750123204ba998bf160cd477b"/>
+    <w:bookmarkEnd w:id="18"/>
+    <w:bookmarkStart w:id="19" w:name="Xff1c17e19db480750123204ba998bf160cd477b"/>
     <w:p>
       <w:pPr>
         <w:pStyle w:val="Heading2"/>
@@ -2010,8 +2052,8 @@
         </w:tc>
       </w:tr>
     </w:tbl>
-    <w:bookmarkEnd w:id="17"/>
-    <w:bookmarkStart w:id="18" w:name="X8de8fe1d907eaae9c1bb1b7a5cd9ab8dee6c6d4"/>
+    <w:bookmarkEnd w:id="19"/>
+    <w:bookmarkStart w:id="20" w:name="X8de8fe1d907eaae9c1bb1b7a5cd9ab8dee6c6d4"/>
     <w:p>
       <w:pPr>
         <w:pStyle w:val="Heading2"/>
@@ -2161,7 +2203,7 @@
         </w:tc>
       </w:tr>
     </w:tbl>
-    <w:bookmarkEnd w:id="18"/>
+    <w:bookmarkEnd w:id="20"/>
     <w:sectPr>
       <w:footnotePr>
         <w:numRestart w:val="eachSect"/>

</xml_diff>

<commit_message>
Add Doc15 and Doc16 Peru reports
</commit_message>
<xml_diff>
--- a/docs/SCW16-Doc00.docx
+++ b/docs/SCW16-Doc00.docx
@@ -84,7 +84,7 @@
         <w:t xml:space="preserve">Erich Diaz, Ignacio Payá, José Zenteno, Sebastián Vásquez, and Niels Hintzen.</w:t>
       </w:r>
     </w:p>
-    <w:bookmarkStart w:id="13" w:name="X3c14e84487627fe36a19ff569c774c2d12c20b1"/>
+    <w:bookmarkStart w:id="14" w:name="X3c14e84487627fe36a19ff569c774c2d12c20b1"/>
     <w:p>
       <w:pPr>
         <w:pStyle w:val="Heading2"/>
@@ -327,7 +327,7 @@
       </w:tr>
     </w:tbl>
     <w:bookmarkEnd w:id="9"/>
-    <w:bookmarkStart w:id="10" w:name="session-1"/>
+    <w:bookmarkStart w:id="11" w:name="session-1"/>
     <w:p>
       <w:pPr>
         <w:pStyle w:val="Heading3"/>
@@ -624,8 +624,19 @@
               <w:pStyle w:val="Compact"/>
             </w:pPr>
             <w:r>
-              <w:t xml:space="preserve">Review of jack mackerel acoustic assessments conducted in Peru</w:t>
-            </w:r>
+              <w:t xml:space="preserve">Review of jack mackerel acoustic assessments conducted in Peru, including</w:t>
+            </w:r>
+            <w:r>
+              <w:t xml:space="preserve"> </w:t>
+            </w:r>
+            <w:hyperlink r:id="rId10">
+              <w:r>
+                <w:rPr>
+                  <w:rStyle w:val="Hyperlink"/>
+                </w:rPr>
+                <w:t xml:space="preserve">SCW16-Doc16</w:t>
+              </w:r>
+            </w:hyperlink>
           </w:p>
         </w:tc>
         <w:tc>
@@ -641,8 +652,8 @@
         </w:tc>
       </w:tr>
     </w:tbl>
-    <w:bookmarkEnd w:id="10"/>
-    <w:bookmarkStart w:id="11" w:name="session-2"/>
+    <w:bookmarkEnd w:id="11"/>
+    <w:bookmarkStart w:id="12" w:name="session-2"/>
     <w:p>
       <w:pPr>
         <w:pStyle w:val="Heading3"/>
@@ -804,8 +815,8 @@
         </w:tc>
       </w:tr>
     </w:tbl>
-    <w:bookmarkEnd w:id="11"/>
-    <w:bookmarkStart w:id="12" w:name="session-3"/>
+    <w:bookmarkEnd w:id="12"/>
+    <w:bookmarkStart w:id="13" w:name="session-3"/>
     <w:p>
       <w:pPr>
         <w:pStyle w:val="Heading3"/>
@@ -1002,9 +1013,9 @@
         </w:tc>
       </w:tr>
     </w:tbl>
-    <w:bookmarkEnd w:id="12"/>
     <w:bookmarkEnd w:id="13"/>
-    <w:bookmarkStart w:id="15" w:name="X714c2cb5fc0ded1c3db2bdb64c8d0ee6121c99c"/>
+    <w:bookmarkEnd w:id="14"/>
+    <w:bookmarkStart w:id="17" w:name="X714c2cb5fc0ded1c3db2bdb64c8d0ee6121c99c"/>
     <w:p>
       <w:pPr>
         <w:pStyle w:val="Heading2"/>
@@ -1012,7 +1023,7 @@
       <w:r>
         <w:t xml:space="preserve">Day 2. Preliminary CPUE Session Agenda (</w:t>
       </w:r>
-      <w:hyperlink r:id="rId14">
+      <w:hyperlink r:id="rId15">
         <w:r>
           <w:rPr>
             <w:rStyle w:val="Hyperlink"/>
@@ -1046,7 +1057,7 @@
       <w:r>
         <w:t xml:space="preserve"> </w:t>
       </w:r>
-      <w:hyperlink r:id="rId14">
+      <w:hyperlink r:id="rId15">
         <w:r>
           <w:rPr>
             <w:rStyle w:val="Hyperlink"/>
@@ -1075,7 +1086,21 @@
         <w:pStyle w:val="BodyText"/>
       </w:pPr>
       <w:r>
-        <w:t xml:space="preserve">The Peruvian delegation has requested time during the CPUE session for the report</w:t>
+        <w:t xml:space="preserve">The Peruvian delegation has requested time during the CPUE session for</w:t>
+      </w:r>
+      <w:r>
+        <w:t xml:space="preserve"> </w:t>
+      </w:r>
+      <w:hyperlink r:id="rId16">
+        <w:r>
+          <w:rPr>
+            <w:rStyle w:val="Hyperlink"/>
+          </w:rPr>
+          <w:t xml:space="preserve">SCW16-Doc15</w:t>
+        </w:r>
+      </w:hyperlink>
+      <w:r>
+        <w:t xml:space="preserve">,</w:t>
       </w:r>
       <w:r>
         <w:t xml:space="preserve"> </w:t>
@@ -1085,7 +1110,7 @@
           <w:i/>
           <w:iCs/>
         </w:rPr>
-        <w:t xml:space="preserve">Standardization of catch-per-unit-effort (CPUE) for jack mackerel (2015-2025)</w:t>
+        <w:t xml:space="preserve">Standardization of catch-per-unit-effort</w:t>
       </w:r>
       <w:r>
         <w:rPr>
@@ -1099,7 +1124,7 @@
           <w:i/>
           <w:iCs/>
         </w:rPr>
-        <w:t xml:space="preserve">in Peruvian national jurisdictional waters</w:t>
+        <w:t xml:space="preserve">(CPUE) for jack mackerel (2015-2025) in Peruvian national jurisdictional waters</w:t>
       </w:r>
       <w:r>
         <w:t xml:space="preserve"> </w:t>
@@ -1263,6 +1288,20 @@
             <w:r>
               <w:t xml:space="preserve"> </w:t>
             </w:r>
+            <w:hyperlink r:id="rId16">
+              <w:r>
+                <w:rPr>
+                  <w:rStyle w:val="Hyperlink"/>
+                </w:rPr>
+                <w:t xml:space="preserve">SCW16-Doc15</w:t>
+              </w:r>
+            </w:hyperlink>
+            <w:r>
+              <w:t xml:space="preserve">,</w:t>
+            </w:r>
+            <w:r>
+              <w:t xml:space="preserve"> </w:t>
+            </w:r>
             <w:r>
               <w:rPr>
                 <w:i/>
@@ -1470,8 +1509,8 @@
         </w:tc>
       </w:tr>
     </w:tbl>
-    <w:bookmarkEnd w:id="15"/>
-    <w:bookmarkStart w:id="18" w:name="Xdddbf6479f3c4ab0ba51ce45a980492bec0f743"/>
+    <w:bookmarkEnd w:id="17"/>
+    <w:bookmarkStart w:id="20" w:name="Xdddbf6479f3c4ab0ba51ce45a980492bec0f743"/>
     <w:p>
       <w:pPr>
         <w:pStyle w:val="Heading2"/>
@@ -1566,7 +1605,7 @@
       <w:r>
         <w:t xml:space="preserve"> </w:t>
       </w:r>
-      <w:hyperlink r:id="rId16">
+      <w:hyperlink r:id="rId18">
         <w:r>
           <w:rPr>
             <w:rStyle w:val="Hyperlink"/>
@@ -1644,7 +1683,7 @@
           <w:numId w:val="1002"/>
         </w:numPr>
       </w:pPr>
-      <w:hyperlink r:id="rId17">
+      <w:hyperlink r:id="rId19">
         <w:r>
           <w:rPr>
             <w:rStyle w:val="Hyperlink"/>
@@ -1708,12 +1747,26 @@
           <w:numId w:val="1002"/>
         </w:numPr>
       </w:pPr>
+      <w:hyperlink r:id="rId10">
+        <w:r>
+          <w:rPr>
+            <w:rStyle w:val="Hyperlink"/>
+          </w:rPr>
+          <w:t xml:space="preserve">SCW16-Doc16</w:t>
+        </w:r>
+      </w:hyperlink>
+      <w:r>
+        <w:t xml:space="preserve">,</w:t>
+      </w:r>
+      <w:r>
+        <w:t xml:space="preserve"> </w:t>
+      </w:r>
       <w:r>
         <w:rPr>
           <w:i/>
           <w:iCs/>
         </w:rPr>
-        <w:t xml:space="preserve">Considerations on the use of the jack mackerel acoustic index in Peruvian</w:t>
+        <w:t xml:space="preserve">Considerations on the use</w:t>
       </w:r>
       <w:r>
         <w:rPr>
@@ -1727,19 +1780,13 @@
           <w:i/>
           <w:iCs/>
         </w:rPr>
-        <w:t xml:space="preserve">national jurisdictional waters</w:t>
-      </w:r>
-      <w:r>
-        <w:t xml:space="preserve"> </w:t>
-      </w:r>
-      <w:r>
-        <w:t xml:space="preserve">(Gersson Roman, Sandra Cahuin and Marilú</w:t>
-      </w:r>
-      <w:r>
-        <w:t xml:space="preserve"> </w:t>
-      </w:r>
-      <w:r>
-        <w:t xml:space="preserve">Bouchon).</w:t>
+        <w:t xml:space="preserve">of the jack mackerel acoustic index in Peruvian national jurisdictional waters</w:t>
+      </w:r>
+      <w:r>
+        <w:t xml:space="preserve"> </w:t>
+      </w:r>
+      <w:r>
+        <w:t xml:space="preserve">(Gersson Roman, Sandra Cahuin and Marilú Bouchon).</w:t>
       </w:r>
     </w:p>
     <w:tbl>
@@ -1863,8 +1910,8 @@
         </w:tc>
       </w:tr>
     </w:tbl>
-    <w:bookmarkEnd w:id="18"/>
-    <w:bookmarkStart w:id="19" w:name="Xff1c17e19db480750123204ba998bf160cd477b"/>
+    <w:bookmarkEnd w:id="20"/>
+    <w:bookmarkStart w:id="21" w:name="Xff1c17e19db480750123204ba998bf160cd477b"/>
     <w:p>
       <w:pPr>
         <w:pStyle w:val="Heading2"/>
@@ -2052,8 +2099,8 @@
         </w:tc>
       </w:tr>
     </w:tbl>
-    <w:bookmarkEnd w:id="19"/>
-    <w:bookmarkStart w:id="20" w:name="X8de8fe1d907eaae9c1bb1b7a5cd9ab8dee6c6d4"/>
+    <w:bookmarkEnd w:id="21"/>
+    <w:bookmarkStart w:id="22" w:name="X8de8fe1d907eaae9c1bb1b7a5cd9ab8dee6c6d4"/>
     <w:p>
       <w:pPr>
         <w:pStyle w:val="Heading2"/>
@@ -2203,7 +2250,7 @@
         </w:tc>
       </w:tr>
     </w:tbl>
-    <w:bookmarkEnd w:id="20"/>
+    <w:bookmarkEnd w:id="22"/>
     <w:sectPr>
       <w:footnotePr>
         <w:numRestart w:val="eachSect"/>

</xml_diff>